<commit_message>
chore(deliverables): week 8 — date roll, distinct banner placements, arena showcase, light band
</commit_message>
<xml_diff>
--- a/exports/course-context.docx
+++ b/exports/course-context.docx
@@ -114,7 +114,7 @@
           <w:i w:val="0"/>
           <w:sz w:val="22"/>
         </w:rPr>
-        <w:t xml:space="preserve"> 28 May 2026 — Week 7 of 8</w:t>
+        <w:t xml:space="preserve"> 29 May 2026 — Week 8 of 8</w:t>
       </w:r>
     </w:p>
     <w:p>
@@ -772,7 +772,7 @@
           <w:i w:val="0"/>
           <w:sz w:val="22"/>
         </w:rPr>
-        <w:t>Week 7 (current) — Prototype demos and dry runs.</w:t>
+        <w:t>Week 7 — Prototype demos and dry runs.</w:t>
       </w:r>
       <w:r>
         <w:rPr>
@@ -780,7 +780,15 @@
           <w:i w:val="0"/>
           <w:sz w:val="22"/>
         </w:rPr>
-        <w:t xml:space="preserve"> The deliverables portal, the run guide, and the learning guide are produced in this week to support the demo.</w:t>
+        <w:t xml:space="preserve"> The deliverables portal, the run guide, and the learning guide were produced this week to support the demo. </w:t>
+      </w:r>
+      <w:r>
+        <w:rPr>
+          <w:b/>
+          <w:i w:val="0"/>
+          <w:sz w:val="22"/>
+        </w:rPr>
+        <w:t>Week 8 (current) — Final report, defence rehearsal, viva.</w:t>
       </w:r>
     </w:p>
     <w:p>

</xml_diff>